<commit_message>
Update main branch in remote
</commit_message>
<xml_diff>
--- a/Documentation/research_proposal.docx
+++ b/Documentation/research_proposal.docx
@@ -1982,23 +1982,39 @@
           <w:sz w:val="22"/>
           <w:szCs w:val="22"/>
         </w:rPr>
-        <w:t xml:space="preserve">To build a balanced dataset from two open-access CXR sources, CheXpert for normal and pneumonia cases, and TBX11K for tuberculosis, combining </w:t>
-      </w:r>
-      <w:r>
-        <w:rPr>
-          <w:rFonts w:ascii="Times New Roman" w:hAnsi="Times New Roman"/>
-          <w:sz w:val="22"/>
-          <w:szCs w:val="22"/>
-        </w:rPr>
-        <w:t xml:space="preserve">around </w:t>
-      </w:r>
-      <w:r>
-        <w:rPr>
-          <w:rFonts w:ascii="Times New Roman" w:hAnsi="Times New Roman"/>
-          <w:sz w:val="22"/>
-          <w:szCs w:val="22"/>
-        </w:rPr>
-        <w:t>5,000 images per class and pre-processed to 256×256 resolution for training.</w:t>
+        <w:t xml:space="preserve">To build a balanced dataset from two open-access CXR sources, CheXpert for normal and pneumonia cases, and TBX11K for tuberculosis, combining around 5,000 images per class and pre-processed to </w:t>
+      </w:r>
+      <w:r>
+        <w:rPr>
+          <w:rFonts w:ascii="Times New Roman" w:hAnsi="Times New Roman"/>
+          <w:sz w:val="22"/>
+          <w:szCs w:val="22"/>
+        </w:rPr>
+        <w:t>320</w:t>
+      </w:r>
+      <w:r>
+        <w:rPr>
+          <w:rFonts w:ascii="Times New Roman" w:hAnsi="Times New Roman"/>
+          <w:sz w:val="22"/>
+          <w:szCs w:val="22"/>
+        </w:rPr>
+        <w:t>×</w:t>
+      </w:r>
+      <w:r>
+        <w:rPr>
+          <w:rFonts w:ascii="Times New Roman" w:hAnsi="Times New Roman"/>
+          <w:sz w:val="22"/>
+          <w:szCs w:val="22"/>
+        </w:rPr>
+        <w:t>320</w:t>
+      </w:r>
+      <w:r>
+        <w:rPr>
+          <w:rFonts w:ascii="Times New Roman" w:hAnsi="Times New Roman"/>
+          <w:sz w:val="22"/>
+          <w:szCs w:val="22"/>
+        </w:rPr>
+        <w:t xml:space="preserve"> resolution for training.</w:t>
       </w:r>
     </w:p>
     <w:p>
@@ -4296,7 +4312,39 @@
           <w:sz w:val="22"/>
           <w:szCs w:val="22"/>
         </w:rPr>
-        <w:t xml:space="preserve">All images will be resized to 256×256 pixels, balancing the trade-off between preserving anatomical detail and minimising computational load. Normalisation will be applied to scale pixel values between 0 and 1, standardising inputs for neural network training. To improve generalisation and mitigate class imbalance, the dataset will be augmented with common transformations such as horizontal flipping, random rotations, and zoom operations. These steps ensure model robustness without increasing the original dataset size excessively </w:t>
+        <w:t xml:space="preserve">All images will be resized to </w:t>
+      </w:r>
+      <w:r>
+        <w:rPr>
+          <w:rFonts w:ascii="Times New Roman" w:hAnsi="Times New Roman"/>
+          <w:sz w:val="22"/>
+          <w:szCs w:val="22"/>
+        </w:rPr>
+        <w:t>320</w:t>
+      </w:r>
+      <w:r>
+        <w:rPr>
+          <w:rFonts w:ascii="Times New Roman" w:hAnsi="Times New Roman"/>
+          <w:sz w:val="22"/>
+          <w:szCs w:val="22"/>
+        </w:rPr>
+        <w:t>×</w:t>
+      </w:r>
+      <w:r>
+        <w:rPr>
+          <w:rFonts w:ascii="Times New Roman" w:hAnsi="Times New Roman"/>
+          <w:sz w:val="22"/>
+          <w:szCs w:val="22"/>
+        </w:rPr>
+        <w:t>320</w:t>
+      </w:r>
+      <w:r>
+        <w:rPr>
+          <w:rFonts w:ascii="Times New Roman" w:hAnsi="Times New Roman"/>
+          <w:sz w:val="22"/>
+          <w:szCs w:val="22"/>
+        </w:rPr>
+        <w:t xml:space="preserve"> pixels, balancing the trade-off between preserving anatomical detail and minimising computational load. Normalisation will be applied to scale pixel values between 0 and 1, standardising inputs for neural network training. To improve generalisation and mitigate class imbalance, the dataset will be augmented with common transformations such as horizontal flipping, random rotations, and zoom operations. These steps ensure model robustness without increasing the original dataset size excessively </w:t>
       </w:r>
       <w:bookmarkStart w:id="27" w:name="ZOTERO_BREF_AGjlNmEIzefg"/>
       <w:r>
@@ -8571,7 +8619,7 @@
     <w:pPr>
       <w:widowControl/>
       <w:suppressAutoHyphens w:val="true"/>
-      <w:overflowPunct w:val="false"/>
+      <w:overflowPunct w:val="true"/>
       <w:bidi w:val="0"/>
       <w:spacing w:before="0" w:after="0"/>
       <w:jc w:val="start"/>
@@ -8638,8 +8686,8 @@
       <w:bCs/>
     </w:rPr>
   </w:style>
-  <w:style w:type="character" w:styleId="Bulletsuser">
-    <w:name w:val="Bullets (user)"/>
+  <w:style w:type="character" w:styleId="Bullets">
+    <w:name w:val="Bullets"/>
     <w:qFormat/>
     <w:rPr>
       <w:rFonts w:ascii="OpenSymbol" w:hAnsi="OpenSymbol" w:eastAsia="OpenSymbol" w:cs="OpenSymbol"/>
@@ -8731,8 +8779,8 @@
     </w:pPr>
     <w:rPr/>
   </w:style>
-  <w:style w:type="paragraph" w:styleId="FrameContentsuser">
-    <w:name w:val="Frame Contents (user)"/>
+  <w:style w:type="paragraph" w:styleId="FrameContents">
+    <w:name w:val="Frame Contents"/>
     <w:basedOn w:val="Normal"/>
     <w:qFormat/>
     <w:pPr/>

</xml_diff>